<commit_message>
docs: adicao de resumo em portugues (incompleto)
</commit_message>
<xml_diff>
--- a/Documents/ETEC-TCC.docx
+++ b/Documents/ETEC-TCC.docx
@@ -1,6 +1,6 @@
 
 <file path=word/document.xml><?xml version="1.0" encoding="utf-8"?>
-<w:document xmlns:wpc="http://schemas.microsoft.com/office/word/2010/wordprocessingCanvas" xmlns:cx="http://schemas.microsoft.com/office/drawing/2014/chartex" xmlns:cx1="http://schemas.microsoft.com/office/drawing/2015/9/8/chartex" xmlns:cx2="http://schemas.microsoft.com/office/drawing/2015/10/21/chartex" xmlns:cx3="http://schemas.microsoft.com/office/drawing/2016/5/9/chartex" xmlns:cx4="http://schemas.microsoft.com/office/drawing/2016/5/10/chartex" xmlns:cx5="http://schemas.microsoft.com/office/drawing/2016/5/11/chartex" xmlns:cx6="http://schemas.microsoft.com/office/drawing/2016/5/12/chartex" xmlns:cx7="http://schemas.microsoft.com/office/drawing/2016/5/13/chartex" xmlns:cx8="http://schemas.microsoft.com/office/drawing/2016/5/14/chartex" xmlns:mc="http://schemas.openxmlformats.org/markup-compatibility/2006" xmlns:aink="http://schemas.microsoft.com/office/drawing/2016/ink" xmlns:am3d="http://schemas.microsoft.com/office/drawing/2017/model3d" xmlns:o="urn:schemas-microsoft-com:office:office" xmlns:oel="http://schemas.microsoft.com/office/2019/extlst" xmlns:r="http://schemas.openxmlformats.org/officeDocument/2006/relationships" xmlns:m="http://schemas.openxmlformats.org/officeDocument/2006/math" xmlns:v="urn:schemas-microsoft-com:vml" xmlns:wp14="http://schemas.microsoft.com/office/word/2010/wordprocessingDrawing" xmlns:wp="http://schemas.openxmlformats.org/drawingml/2006/wordprocessingDrawing" xmlns:w10="urn:schemas-microsoft-com:office:word" xmlns:w="http://schemas.openxmlformats.org/wordprocessingml/2006/main" xmlns:w14="http://schemas.microsoft.com/office/word/2010/wordml" xmlns:w15="http://schemas.microsoft.com/office/word/2012/wordml" xmlns:w16cex="http://schemas.microsoft.com/office/word/2018/wordml/cex" xmlns:w16cid="http://schemas.microsoft.com/office/word/2016/wordml/cid" xmlns:w16="http://schemas.microsoft.com/office/word/2018/wordml" xmlns:w16du="http://schemas.microsoft.com/office/word/2023/wordml/word16du" xmlns:w16sdtdh="http://schemas.microsoft.com/office/word/2020/wordml/sdtdatahash" xmlns:w16sdtfl="http://schemas.microsoft.com/office/word/2024/wordml/sdtformatlock" xmlns:w16se="http://schemas.microsoft.com/office/word/2015/wordml/symex" xmlns:wpg="http://schemas.microsoft.com/office/word/2010/wordprocessingGroup" xmlns:wpi="http://schemas.microsoft.com/office/word/2010/wordprocessingInk" xmlns:wne="http://schemas.microsoft.com/office/word/2006/wordml" xmlns:wps="http://schemas.microsoft.com/office/word/2010/wordprocessingShape" mc:Ignorable="w14 w15 w16se w16cid w16 w16cex w16sdtdh w16sdtfl w16du wp14">
+<w:document xmlns:wpc="http://schemas.microsoft.com/office/word/2010/wordprocessingCanvas" xmlns:cx="http://schemas.microsoft.com/office/drawing/2014/chartex" xmlns:mc="http://schemas.openxmlformats.org/markup-compatibility/2006" xmlns:o="urn:schemas-microsoft-com:office:office" xmlns:r="http://schemas.openxmlformats.org/officeDocument/2006/relationships" xmlns:m="http://schemas.openxmlformats.org/officeDocument/2006/math" xmlns:v="urn:schemas-microsoft-com:vml" xmlns:wp14="http://schemas.microsoft.com/office/word/2010/wordprocessingDrawing" xmlns:wp="http://schemas.openxmlformats.org/drawingml/2006/wordprocessingDrawing" xmlns:w10="urn:schemas-microsoft-com:office:word" xmlns:w="http://schemas.openxmlformats.org/wordprocessingml/2006/main" xmlns:w14="http://schemas.microsoft.com/office/word/2010/wordml" xmlns:w15="http://schemas.microsoft.com/office/word/2012/wordml" xmlns:w16se="http://schemas.microsoft.com/office/word/2015/wordml/symex" xmlns:wpg="http://schemas.microsoft.com/office/word/2010/wordprocessingGroup" xmlns:wpi="http://schemas.microsoft.com/office/word/2010/wordprocessingInk" xmlns:wne="http://schemas.microsoft.com/office/word/2006/wordml" xmlns:wps="http://schemas.microsoft.com/office/word/2010/wordprocessingShape" mc:Ignorable="w14 w15 w16se wp14">
   <w:body>
     <w:p>
       <w:pPr>
@@ -581,6 +581,7 @@
           <w:noProof/>
           <w:sz w:val="28"/>
           <w:szCs w:val="28"/>
+          <w:lang w:eastAsia="pt-BR"/>
         </w:rPr>
         <mc:AlternateContent>
           <mc:Choice Requires="wps">
@@ -703,7 +704,7 @@
                 <v:stroke joinstyle="miter"/>
                 <v:path gradientshapeok="t" o:connecttype="rect"/>
               </v:shapetype>
-              <v:shape id="Caixa de Texto 2" o:spid="_x0000_s1026" type="#_x0000_t202" style="position:absolute;left:0;text-align:left;margin-left:250.6pt;margin-top:25.35pt;width:242pt;height:110.6pt;z-index:251661312;visibility:visible;mso-wrap-style:square;mso-width-percent:0;mso-height-percent:200;mso-wrap-distance-left:9pt;mso-wrap-distance-top:3.6pt;mso-wrap-distance-right:9pt;mso-wrap-distance-bottom:3.6pt;mso-position-horizontal:absolute;mso-position-horizontal-relative:margin;mso-position-vertical:absolute;mso-position-vertical-relative:text;mso-width-percent:0;mso-height-percent:200;mso-width-relative:margin;mso-height-relative:margin;v-text-anchor:top" o:gfxdata="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">
+              <v:shape id="Caixa de Texto 2" o:spid="_x0000_s1026" type="#_x0000_t202" style="position:absolute;left:0;text-align:left;margin-left:250.6pt;margin-top:25.35pt;width:242pt;height:110.6pt;z-index:251661312;visibility:visible;mso-wrap-style:square;mso-width-percent:0;mso-height-percent:200;mso-wrap-distance-left:9pt;mso-wrap-distance-top:3.6pt;mso-wrap-distance-right:9pt;mso-wrap-distance-bottom:3.6pt;mso-position-horizontal:absolute;mso-position-horizontal-relative:margin;mso-position-vertical:absolute;mso-position-vertical-relative:text;mso-width-percent:0;mso-height-percent:200;mso-width-relative:margin;mso-height-relative:margin;v-text-anchor:top" o:gfxdata="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">
                 <v:textbox style="mso-fit-shape-to-text:t">
                   <w:txbxContent>
                     <w:p>
@@ -933,33 +934,43 @@
           <w:sz w:val="28"/>
           <w:szCs w:val="28"/>
         </w:rPr>
-        <w:t>AGRADECIMENTOS:</w:t>
-      </w:r>
-    </w:p>
-    <w:p>
-      <w:pPr>
-        <w:jc w:val="center"/>
-        <w:rPr>
-          <w:rFonts w:ascii="Arial" w:hAnsi="Arial" w:cs="Arial"/>
-          <w:b/>
-          <w:sz w:val="28"/>
-          <w:szCs w:val="28"/>
-        </w:rPr>
-      </w:pPr>
-    </w:p>
-    <w:p>
-      <w:pPr>
-        <w:jc w:val="center"/>
-        <w:rPr>
-          <w:rFonts w:ascii="Arial" w:hAnsi="Arial" w:cs="Arial"/>
-          <w:b/>
-          <w:sz w:val="28"/>
-          <w:szCs w:val="28"/>
-        </w:rPr>
-      </w:pPr>
-    </w:p>
-    <w:p>
-      <w:pPr>
+        <w:t>RESUMO</w:t>
+      </w:r>
+      <w:r>
+        <w:rPr>
+          <w:rFonts w:ascii="Arial" w:hAnsi="Arial" w:cs="Arial"/>
+          <w:b/>
+          <w:sz w:val="28"/>
+          <w:szCs w:val="28"/>
+        </w:rPr>
+        <w:t>:</w:t>
+      </w:r>
+    </w:p>
+    <w:p>
+      <w:pPr>
+        <w:jc w:val="center"/>
+        <w:rPr>
+          <w:rFonts w:ascii="Arial" w:hAnsi="Arial" w:cs="Arial"/>
+          <w:b/>
+          <w:sz w:val="28"/>
+          <w:szCs w:val="28"/>
+        </w:rPr>
+      </w:pPr>
+    </w:p>
+    <w:p>
+      <w:pPr>
+        <w:jc w:val="center"/>
+        <w:rPr>
+          <w:rFonts w:ascii="Arial" w:hAnsi="Arial" w:cs="Arial"/>
+          <w:b/>
+          <w:sz w:val="28"/>
+          <w:szCs w:val="28"/>
+        </w:rPr>
+      </w:pPr>
+    </w:p>
+    <w:p>
+      <w:pPr>
+        <w:ind w:left="708"/>
         <w:jc w:val="center"/>
         <w:rPr>
           <w:rFonts w:ascii="Arial" w:hAnsi="Arial" w:cs="Arial"/>
@@ -971,267 +982,446 @@
       <w:r>
         <w:rPr>
           <w:rFonts w:ascii="Arial" w:hAnsi="Arial" w:cs="Arial"/>
-          <w:bCs/>
-          <w:sz w:val="28"/>
-          <w:szCs w:val="28"/>
-        </w:rPr>
-        <w:t>Agradecemos a Thiago Gonçalves Mendes pela ajuda e a atenção para auxiliar com o nosso TCC e como organizá-lo</w:t>
-      </w:r>
-    </w:p>
-    <w:p>
-      <w:pPr>
-        <w:jc w:val="center"/>
-        <w:rPr>
-          <w:rFonts w:ascii="Arial" w:hAnsi="Arial" w:cs="Arial"/>
-          <w:b/>
-          <w:sz w:val="28"/>
-          <w:szCs w:val="28"/>
-        </w:rPr>
-      </w:pPr>
-    </w:p>
-    <w:p>
-      <w:pPr>
-        <w:jc w:val="center"/>
-        <w:rPr>
-          <w:rFonts w:ascii="Arial" w:hAnsi="Arial" w:cs="Arial"/>
-          <w:b/>
-          <w:sz w:val="28"/>
-          <w:szCs w:val="28"/>
-        </w:rPr>
-      </w:pPr>
-    </w:p>
-    <w:p>
-      <w:pPr>
-        <w:jc w:val="center"/>
-        <w:rPr>
-          <w:rFonts w:ascii="Arial" w:hAnsi="Arial" w:cs="Arial"/>
-          <w:b/>
-          <w:sz w:val="28"/>
-          <w:szCs w:val="28"/>
-        </w:rPr>
-      </w:pPr>
-    </w:p>
-    <w:p>
-      <w:pPr>
-        <w:jc w:val="center"/>
-        <w:rPr>
-          <w:rFonts w:ascii="Arial" w:hAnsi="Arial" w:cs="Arial"/>
-          <w:b/>
-          <w:sz w:val="28"/>
-          <w:szCs w:val="28"/>
-        </w:rPr>
-      </w:pPr>
-    </w:p>
-    <w:p>
-      <w:pPr>
-        <w:jc w:val="center"/>
-        <w:rPr>
-          <w:rFonts w:ascii="Arial" w:hAnsi="Arial" w:cs="Arial"/>
-          <w:b/>
-          <w:sz w:val="28"/>
-          <w:szCs w:val="28"/>
-        </w:rPr>
-      </w:pPr>
-    </w:p>
-    <w:p>
-      <w:pPr>
-        <w:jc w:val="center"/>
-        <w:rPr>
-          <w:rFonts w:ascii="Arial" w:hAnsi="Arial" w:cs="Arial"/>
-          <w:b/>
-          <w:sz w:val="28"/>
-          <w:szCs w:val="28"/>
-        </w:rPr>
-      </w:pPr>
-    </w:p>
-    <w:p>
-      <w:pPr>
-        <w:jc w:val="center"/>
-        <w:rPr>
-          <w:rFonts w:ascii="Arial" w:hAnsi="Arial" w:cs="Arial"/>
-          <w:b/>
-          <w:sz w:val="28"/>
-          <w:szCs w:val="28"/>
-        </w:rPr>
-      </w:pPr>
-    </w:p>
-    <w:p>
-      <w:pPr>
-        <w:jc w:val="center"/>
-        <w:rPr>
-          <w:rFonts w:ascii="Arial" w:hAnsi="Arial" w:cs="Arial"/>
-          <w:b/>
-          <w:sz w:val="28"/>
-          <w:szCs w:val="28"/>
-        </w:rPr>
-      </w:pPr>
-    </w:p>
-    <w:p>
-      <w:pPr>
-        <w:jc w:val="center"/>
-        <w:rPr>
-          <w:rFonts w:ascii="Arial" w:hAnsi="Arial" w:cs="Arial"/>
-          <w:b/>
-          <w:sz w:val="28"/>
-          <w:szCs w:val="28"/>
-        </w:rPr>
-      </w:pPr>
-    </w:p>
-    <w:p>
-      <w:pPr>
-        <w:jc w:val="center"/>
-        <w:rPr>
-          <w:rFonts w:ascii="Arial" w:hAnsi="Arial" w:cs="Arial"/>
-          <w:b/>
-          <w:sz w:val="28"/>
-          <w:szCs w:val="28"/>
-        </w:rPr>
-      </w:pPr>
-    </w:p>
-    <w:p>
-      <w:pPr>
-        <w:jc w:val="center"/>
-        <w:rPr>
-          <w:rFonts w:ascii="Arial" w:hAnsi="Arial" w:cs="Arial"/>
-          <w:b/>
-          <w:sz w:val="28"/>
-          <w:szCs w:val="28"/>
-        </w:rPr>
-      </w:pPr>
-    </w:p>
-    <w:p>
-      <w:pPr>
-        <w:jc w:val="center"/>
-        <w:rPr>
-          <w:rFonts w:ascii="Arial" w:hAnsi="Arial" w:cs="Arial"/>
-          <w:b/>
-          <w:sz w:val="28"/>
-          <w:szCs w:val="28"/>
-        </w:rPr>
-      </w:pPr>
-    </w:p>
-    <w:p>
-      <w:pPr>
-        <w:jc w:val="center"/>
-        <w:rPr>
-          <w:rFonts w:ascii="Arial" w:hAnsi="Arial" w:cs="Arial"/>
-          <w:b/>
-          <w:sz w:val="28"/>
-          <w:szCs w:val="28"/>
-        </w:rPr>
-      </w:pPr>
-    </w:p>
-    <w:p>
-      <w:pPr>
-        <w:jc w:val="center"/>
-        <w:rPr>
-          <w:rFonts w:ascii="Arial" w:hAnsi="Arial" w:cs="Arial"/>
-          <w:b/>
-          <w:sz w:val="28"/>
-          <w:szCs w:val="28"/>
-        </w:rPr>
-      </w:pPr>
-    </w:p>
-    <w:p>
-      <w:pPr>
-        <w:jc w:val="center"/>
-        <w:rPr>
-          <w:rFonts w:ascii="Arial" w:hAnsi="Arial" w:cs="Arial"/>
-          <w:b/>
-          <w:sz w:val="28"/>
-          <w:szCs w:val="28"/>
-        </w:rPr>
-      </w:pPr>
-    </w:p>
-    <w:p>
-      <w:pPr>
-        <w:jc w:val="center"/>
-        <w:rPr>
-          <w:rFonts w:ascii="Arial" w:hAnsi="Arial" w:cs="Arial"/>
-          <w:b/>
-          <w:sz w:val="28"/>
-          <w:szCs w:val="28"/>
-        </w:rPr>
-      </w:pPr>
-    </w:p>
-    <w:p>
-      <w:pPr>
-        <w:jc w:val="center"/>
-        <w:rPr>
-          <w:rFonts w:ascii="Arial" w:hAnsi="Arial" w:cs="Arial"/>
-          <w:b/>
-          <w:sz w:val="28"/>
-          <w:szCs w:val="28"/>
-        </w:rPr>
-      </w:pPr>
-    </w:p>
-    <w:p>
-      <w:pPr>
-        <w:jc w:val="center"/>
-        <w:rPr>
-          <w:rFonts w:ascii="Arial" w:hAnsi="Arial" w:cs="Arial"/>
-          <w:b/>
-          <w:sz w:val="28"/>
-          <w:szCs w:val="28"/>
-        </w:rPr>
-      </w:pPr>
-    </w:p>
-    <w:p>
-      <w:pPr>
-        <w:jc w:val="center"/>
-        <w:rPr>
-          <w:rFonts w:ascii="Arial" w:hAnsi="Arial" w:cs="Arial"/>
-          <w:b/>
-          <w:sz w:val="28"/>
-          <w:szCs w:val="28"/>
-        </w:rPr>
-      </w:pPr>
-    </w:p>
-    <w:p>
-      <w:pPr>
-        <w:jc w:val="center"/>
-        <w:rPr>
-          <w:rFonts w:ascii="Arial" w:hAnsi="Arial" w:cs="Arial"/>
-          <w:b/>
-          <w:sz w:val="28"/>
-          <w:szCs w:val="28"/>
-        </w:rPr>
-      </w:pPr>
-    </w:p>
-    <w:p>
-      <w:pPr>
-        <w:jc w:val="center"/>
-        <w:rPr>
-          <w:rFonts w:ascii="Arial" w:hAnsi="Arial" w:cs="Arial"/>
-          <w:b/>
-          <w:sz w:val="28"/>
-          <w:szCs w:val="28"/>
-        </w:rPr>
-      </w:pPr>
-    </w:p>
-    <w:p>
-      <w:pPr>
-        <w:jc w:val="center"/>
-        <w:rPr>
-          <w:rFonts w:ascii="Arial" w:hAnsi="Arial" w:cs="Arial"/>
-          <w:b/>
-          <w:sz w:val="28"/>
-          <w:szCs w:val="28"/>
-        </w:rPr>
-      </w:pPr>
-      <w:r>
-        <w:rPr>
-          <w:rFonts w:ascii="Arial" w:hAnsi="Arial" w:cs="Arial"/>
-          <w:b/>
-          <w:sz w:val="28"/>
-          <w:szCs w:val="28"/>
-        </w:rPr>
-        <w:lastRenderedPageBreak/>
+          <w:sz w:val="28"/>
+          <w:szCs w:val="28"/>
+        </w:rPr>
+        <w:t xml:space="preserve">Este artigo tem como objetivo apresentar o </w:t>
+      </w:r>
+      <w:proofErr w:type="spellStart"/>
+      <w:r>
+        <w:rPr>
+          <w:rStyle w:val="nfase"/>
+          <w:rFonts w:ascii="Arial" w:hAnsi="Arial" w:cs="Arial"/>
+          <w:sz w:val="28"/>
+          <w:szCs w:val="28"/>
+        </w:rPr>
+        <w:t>SmartStorage</w:t>
+      </w:r>
+      <w:proofErr w:type="spellEnd"/>
+      <w:r>
+        <w:rPr>
+          <w:rFonts w:ascii="Arial" w:hAnsi="Arial" w:cs="Arial"/>
+          <w:sz w:val="28"/>
+          <w:szCs w:val="28"/>
+        </w:rPr>
+        <w:t xml:space="preserve">, um </w:t>
+      </w:r>
+      <w:r>
+        <w:rPr>
+          <w:rFonts w:ascii="Arial" w:hAnsi="Arial" w:cs="Arial"/>
+          <w:i/>
+          <w:sz w:val="28"/>
+          <w:szCs w:val="28"/>
+        </w:rPr>
+        <w:t>Website</w:t>
+      </w:r>
+      <w:r>
+        <w:rPr>
+          <w:rFonts w:ascii="Arial" w:hAnsi="Arial" w:cs="Arial"/>
+          <w:sz w:val="28"/>
+          <w:szCs w:val="28"/>
+        </w:rPr>
+        <w:t xml:space="preserve"> </w:t>
+      </w:r>
+      <w:r>
+        <w:rPr>
+          <w:rFonts w:ascii="Arial" w:hAnsi="Arial" w:cs="Arial"/>
+          <w:sz w:val="28"/>
+          <w:szCs w:val="28"/>
+        </w:rPr>
+        <w:t xml:space="preserve">desenvolvido para facilitar o gerenciamento de estoques de cozinha. Sua criação </w:t>
+      </w:r>
+      <w:r>
+        <w:rPr>
+          <w:rFonts w:ascii="Arial" w:hAnsi="Arial" w:cs="Arial"/>
+          <w:sz w:val="28"/>
+          <w:szCs w:val="28"/>
+        </w:rPr>
+        <w:t>foi baseada</w:t>
+      </w:r>
+      <w:r>
+        <w:rPr>
+          <w:rFonts w:ascii="Arial" w:hAnsi="Arial" w:cs="Arial"/>
+          <w:sz w:val="28"/>
+          <w:szCs w:val="28"/>
+        </w:rPr>
+        <w:t xml:space="preserve"> pelas dificuldades enfrentadas por cozinheiros e usuários na orga</w:t>
+      </w:r>
+      <w:r>
+        <w:rPr>
+          <w:rFonts w:ascii="Arial" w:hAnsi="Arial" w:cs="Arial"/>
+          <w:sz w:val="28"/>
+          <w:szCs w:val="28"/>
+        </w:rPr>
+        <w:t>nização eficiente de alimentos</w:t>
+      </w:r>
+      <w:r>
+        <w:rPr>
+          <w:rFonts w:ascii="Arial" w:hAnsi="Arial" w:cs="Arial"/>
+          <w:sz w:val="28"/>
+          <w:szCs w:val="28"/>
+        </w:rPr>
+        <w:t xml:space="preserve">. A plataforma permite a criação de estoques personalizados, com funcionalidades como adição e auditoria de itens, categorização especializada, compartilhamento com outros usuários e criação de pratos personalizados. O sistema também conta com recursos avançados, como uma inteligência artificial para sugerir receitas com base nos itens disponíveis e integração com a assistente </w:t>
+      </w:r>
+      <w:r>
+        <w:rPr>
+          <w:rFonts w:ascii="Arial" w:hAnsi="Arial" w:cs="Arial"/>
+          <w:sz w:val="28"/>
+          <w:szCs w:val="28"/>
+        </w:rPr>
+        <w:t xml:space="preserve">virtual </w:t>
+      </w:r>
+      <w:proofErr w:type="spellStart"/>
+      <w:r>
+        <w:rPr>
+          <w:rFonts w:ascii="Arial" w:hAnsi="Arial" w:cs="Arial"/>
+          <w:i/>
+          <w:sz w:val="28"/>
+          <w:szCs w:val="28"/>
+        </w:rPr>
+        <w:t>Alexa</w:t>
+      </w:r>
+      <w:proofErr w:type="spellEnd"/>
+      <w:r>
+        <w:rPr>
+          <w:rFonts w:ascii="Arial" w:hAnsi="Arial" w:cs="Arial"/>
+          <w:i/>
+          <w:sz w:val="28"/>
+          <w:szCs w:val="28"/>
+        </w:rPr>
+        <w:t>,</w:t>
+      </w:r>
+      <w:r>
+        <w:rPr>
+          <w:rFonts w:ascii="Arial" w:hAnsi="Arial" w:cs="Arial"/>
+          <w:sz w:val="28"/>
+          <w:szCs w:val="28"/>
+        </w:rPr>
+        <w:t xml:space="preserve"> proporcionando maior praticidade e interatividade no gerenciamento de estoques culinários.</w:t>
+      </w:r>
+    </w:p>
+    <w:p>
+      <w:pPr>
+        <w:jc w:val="center"/>
+        <w:rPr>
+          <w:rFonts w:ascii="Arial" w:hAnsi="Arial" w:cs="Arial"/>
+          <w:b/>
+          <w:sz w:val="28"/>
+          <w:szCs w:val="28"/>
+        </w:rPr>
+      </w:pPr>
+    </w:p>
+    <w:p>
+      <w:pPr>
+        <w:jc w:val="center"/>
+        <w:rPr>
+          <w:rFonts w:ascii="Arial" w:hAnsi="Arial" w:cs="Arial"/>
+          <w:b/>
+          <w:sz w:val="28"/>
+          <w:szCs w:val="28"/>
+        </w:rPr>
+      </w:pPr>
+    </w:p>
+    <w:p>
+      <w:pPr>
+        <w:jc w:val="center"/>
+        <w:rPr>
+          <w:rFonts w:ascii="Arial" w:hAnsi="Arial" w:cs="Arial"/>
+          <w:b/>
+          <w:sz w:val="28"/>
+          <w:szCs w:val="28"/>
+        </w:rPr>
+      </w:pPr>
+      <w:r>
+        <w:rPr>
+          <w:rFonts w:ascii="Arial" w:hAnsi="Arial" w:cs="Arial"/>
+          <w:b/>
+          <w:sz w:val="28"/>
+          <w:szCs w:val="28"/>
+        </w:rPr>
+        <w:t xml:space="preserve">Palavras chaves: </w:t>
+      </w:r>
+      <w:proofErr w:type="spellStart"/>
+      <w:r>
+        <w:rPr>
+          <w:rFonts w:ascii="Arial" w:hAnsi="Arial" w:cs="Arial"/>
+          <w:b/>
+          <w:sz w:val="28"/>
+          <w:szCs w:val="28"/>
+        </w:rPr>
+        <w:t>Alexa</w:t>
+      </w:r>
+      <w:proofErr w:type="spellEnd"/>
+      <w:r>
+        <w:rPr>
+          <w:rFonts w:ascii="Arial" w:hAnsi="Arial" w:cs="Arial"/>
+          <w:b/>
+          <w:sz w:val="28"/>
+          <w:szCs w:val="28"/>
+        </w:rPr>
+        <w:t xml:space="preserve">, </w:t>
+      </w:r>
+      <w:proofErr w:type="spellStart"/>
+      <w:r>
+        <w:rPr>
+          <w:rFonts w:ascii="Arial" w:hAnsi="Arial" w:cs="Arial"/>
+          <w:b/>
+          <w:sz w:val="28"/>
+          <w:szCs w:val="28"/>
+        </w:rPr>
+        <w:t>SmartStorage</w:t>
+      </w:r>
+      <w:proofErr w:type="spellEnd"/>
+      <w:r>
+        <w:rPr>
+          <w:rFonts w:ascii="Arial" w:hAnsi="Arial" w:cs="Arial"/>
+          <w:b/>
+          <w:sz w:val="28"/>
+          <w:szCs w:val="28"/>
+        </w:rPr>
+        <w:t>, Gerenciamento, Funcionalidades</w:t>
+      </w:r>
+      <w:bookmarkStart w:id="0" w:name="_GoBack"/>
+      <w:bookmarkEnd w:id="0"/>
+    </w:p>
+    <w:p>
+      <w:pPr>
+        <w:jc w:val="center"/>
+        <w:rPr>
+          <w:rFonts w:ascii="Arial" w:hAnsi="Arial" w:cs="Arial"/>
+          <w:b/>
+          <w:sz w:val="28"/>
+          <w:szCs w:val="28"/>
+        </w:rPr>
+      </w:pPr>
+    </w:p>
+    <w:p>
+      <w:pPr>
+        <w:jc w:val="center"/>
+        <w:rPr>
+          <w:rFonts w:ascii="Arial" w:hAnsi="Arial" w:cs="Arial"/>
+          <w:b/>
+          <w:sz w:val="28"/>
+          <w:szCs w:val="28"/>
+        </w:rPr>
+      </w:pPr>
+    </w:p>
+    <w:p>
+      <w:pPr>
+        <w:jc w:val="center"/>
+        <w:rPr>
+          <w:rFonts w:ascii="Arial" w:hAnsi="Arial" w:cs="Arial"/>
+          <w:b/>
+          <w:sz w:val="28"/>
+          <w:szCs w:val="28"/>
+        </w:rPr>
+      </w:pPr>
+    </w:p>
+    <w:p>
+      <w:pPr>
+        <w:jc w:val="center"/>
+        <w:rPr>
+          <w:rFonts w:ascii="Arial" w:hAnsi="Arial" w:cs="Arial"/>
+          <w:b/>
+          <w:sz w:val="28"/>
+          <w:szCs w:val="28"/>
+        </w:rPr>
+      </w:pPr>
+    </w:p>
+    <w:p>
+      <w:pPr>
+        <w:jc w:val="center"/>
+        <w:rPr>
+          <w:rFonts w:ascii="Arial" w:hAnsi="Arial" w:cs="Arial"/>
+          <w:b/>
+          <w:sz w:val="28"/>
+          <w:szCs w:val="28"/>
+        </w:rPr>
+      </w:pPr>
+    </w:p>
+    <w:p>
+      <w:pPr>
+        <w:jc w:val="center"/>
+        <w:rPr>
+          <w:rFonts w:ascii="Arial" w:hAnsi="Arial" w:cs="Arial"/>
+          <w:b/>
+          <w:sz w:val="28"/>
+          <w:szCs w:val="28"/>
+        </w:rPr>
+      </w:pPr>
+    </w:p>
+    <w:p>
+      <w:pPr>
+        <w:jc w:val="center"/>
+        <w:rPr>
+          <w:rFonts w:ascii="Arial" w:hAnsi="Arial" w:cs="Arial"/>
+          <w:b/>
+          <w:sz w:val="28"/>
+          <w:szCs w:val="28"/>
+        </w:rPr>
+      </w:pPr>
+    </w:p>
+    <w:p>
+      <w:pPr>
+        <w:jc w:val="center"/>
+        <w:rPr>
+          <w:rFonts w:ascii="Arial" w:hAnsi="Arial" w:cs="Arial"/>
+          <w:b/>
+          <w:sz w:val="28"/>
+          <w:szCs w:val="28"/>
+        </w:rPr>
+      </w:pPr>
+    </w:p>
+    <w:p>
+      <w:pPr>
+        <w:jc w:val="center"/>
+        <w:rPr>
+          <w:rFonts w:ascii="Arial" w:hAnsi="Arial" w:cs="Arial"/>
+          <w:b/>
+          <w:sz w:val="28"/>
+          <w:szCs w:val="28"/>
+        </w:rPr>
+      </w:pPr>
+    </w:p>
+    <w:p>
+      <w:pPr>
+        <w:jc w:val="center"/>
+        <w:rPr>
+          <w:rFonts w:ascii="Arial" w:hAnsi="Arial" w:cs="Arial"/>
+          <w:b/>
+          <w:sz w:val="28"/>
+          <w:szCs w:val="28"/>
+        </w:rPr>
+      </w:pPr>
+    </w:p>
+    <w:p>
+      <w:pPr>
+        <w:jc w:val="center"/>
+        <w:rPr>
+          <w:rFonts w:ascii="Arial" w:hAnsi="Arial" w:cs="Arial"/>
+          <w:b/>
+          <w:sz w:val="28"/>
+          <w:szCs w:val="28"/>
+        </w:rPr>
+      </w:pPr>
+    </w:p>
+    <w:p>
+      <w:pPr>
+        <w:jc w:val="center"/>
+        <w:rPr>
+          <w:rFonts w:ascii="Arial" w:hAnsi="Arial" w:cs="Arial"/>
+          <w:b/>
+          <w:sz w:val="28"/>
+          <w:szCs w:val="28"/>
+        </w:rPr>
+      </w:pPr>
+    </w:p>
+    <w:p>
+      <w:pPr>
+        <w:jc w:val="center"/>
+        <w:rPr>
+          <w:rFonts w:ascii="Arial" w:hAnsi="Arial" w:cs="Arial"/>
+          <w:b/>
+          <w:sz w:val="28"/>
+          <w:szCs w:val="28"/>
+        </w:rPr>
+      </w:pPr>
+    </w:p>
+    <w:p>
+      <w:pPr>
+        <w:jc w:val="center"/>
+        <w:rPr>
+          <w:rFonts w:ascii="Arial" w:hAnsi="Arial" w:cs="Arial"/>
+          <w:b/>
+          <w:sz w:val="28"/>
+          <w:szCs w:val="28"/>
+        </w:rPr>
+      </w:pPr>
+    </w:p>
+    <w:p>
+      <w:pPr>
+        <w:jc w:val="center"/>
+        <w:rPr>
+          <w:rFonts w:ascii="Arial" w:hAnsi="Arial" w:cs="Arial"/>
+          <w:b/>
+          <w:sz w:val="28"/>
+          <w:szCs w:val="28"/>
+        </w:rPr>
+      </w:pPr>
+    </w:p>
+    <w:p>
+      <w:pPr>
+        <w:jc w:val="center"/>
+        <w:rPr>
+          <w:rFonts w:ascii="Arial" w:hAnsi="Arial" w:cs="Arial"/>
+          <w:b/>
+          <w:sz w:val="28"/>
+          <w:szCs w:val="28"/>
+        </w:rPr>
+      </w:pPr>
+    </w:p>
+    <w:p>
+      <w:pPr>
+        <w:jc w:val="center"/>
+        <w:rPr>
+          <w:rFonts w:ascii="Arial" w:hAnsi="Arial" w:cs="Arial"/>
+          <w:b/>
+          <w:sz w:val="28"/>
+          <w:szCs w:val="28"/>
+        </w:rPr>
+      </w:pPr>
+    </w:p>
+    <w:p>
+      <w:pPr>
+        <w:jc w:val="center"/>
+        <w:rPr>
+          <w:rFonts w:ascii="Arial" w:hAnsi="Arial" w:cs="Arial"/>
+          <w:b/>
+          <w:sz w:val="28"/>
+          <w:szCs w:val="28"/>
+        </w:rPr>
+      </w:pPr>
+    </w:p>
+    <w:p>
+      <w:pPr>
+        <w:jc w:val="center"/>
+        <w:rPr>
+          <w:rFonts w:ascii="Arial" w:hAnsi="Arial" w:cs="Arial"/>
+          <w:b/>
+          <w:sz w:val="28"/>
+          <w:szCs w:val="28"/>
+        </w:rPr>
+      </w:pPr>
+    </w:p>
+    <w:p>
+      <w:pPr>
+        <w:jc w:val="center"/>
+        <w:rPr>
+          <w:rFonts w:ascii="Arial" w:hAnsi="Arial" w:cs="Arial"/>
+          <w:b/>
+          <w:sz w:val="28"/>
+          <w:szCs w:val="28"/>
+        </w:rPr>
+      </w:pPr>
+      <w:r>
+        <w:rPr>
+          <w:rFonts w:ascii="Arial" w:hAnsi="Arial" w:cs="Arial"/>
+          <w:b/>
+          <w:sz w:val="28"/>
+          <w:szCs w:val="28"/>
+        </w:rPr>
         <w:t>SUMÁRIO</w:t>
       </w:r>
     </w:p>
     <w:sdt>
       <w:sdtPr>
+        <w:rPr>
+          <w:rFonts w:asciiTheme="minorHAnsi" w:eastAsiaTheme="minorHAnsi" w:hAnsiTheme="minorHAnsi" w:cstheme="minorBidi"/>
+          <w:color w:val="auto"/>
+          <w:sz w:val="22"/>
+          <w:szCs w:val="22"/>
+          <w:lang w:eastAsia="en-US"/>
+        </w:rPr>
         <w:id w:val="-2105258365"/>
         <w:docPartObj>
           <w:docPartGallery w:val="Table of Contents"/>
@@ -1240,13 +1430,8 @@
       </w:sdtPr>
       <w:sdtEndPr>
         <w:rPr>
-          <w:rFonts w:asciiTheme="minorHAnsi" w:eastAsiaTheme="minorHAnsi" w:hAnsiTheme="minorHAnsi" w:cstheme="minorBidi"/>
           <w:b/>
           <w:bCs/>
-          <w:color w:val="auto"/>
-          <w:sz w:val="22"/>
-          <w:szCs w:val="22"/>
-          <w:lang w:eastAsia="en-US"/>
         </w:rPr>
       </w:sdtEndPr>
       <w:sdtContent>
@@ -1608,7 +1793,7 @@
           <w:szCs w:val="28"/>
         </w:rPr>
       </w:pPr>
-      <w:bookmarkStart w:id="0" w:name="_Toc206615424"/>
+      <w:bookmarkStart w:id="1" w:name="_Toc206615424"/>
       <w:r>
         <w:rPr>
           <w:rStyle w:val="Ttulo1Char"/>
@@ -1633,7 +1818,7 @@
         </w:rPr>
         <w:t>INTRODUÇÃO</w:t>
       </w:r>
-      <w:bookmarkEnd w:id="0"/>
+      <w:bookmarkEnd w:id="1"/>
       <w:r>
         <w:rPr>
           <w:rFonts w:ascii="Arial" w:hAnsi="Arial" w:cs="Arial"/>
@@ -1773,7 +1958,7 @@
           <w:sz w:val="28"/>
           <w:szCs w:val="28"/>
         </w:rPr>
-        <w:t xml:space="preserve">Em ambientes que exigem um estoque, é fundamental que a organização esteja presente, e que seja feita com sucesso e simples de entender, contudo, muitos tem dificuldade em ter uma organização ideal, </w:t>
+        <w:t xml:space="preserve">Em ambientes que exigem um estoque, é fundamental que a organização esteja presente, e que seja feita com sucesso e simples de entender, contudo, </w:t>
       </w:r>
       <w:proofErr w:type="gramStart"/>
       <w:r>
@@ -1782,7 +1967,7 @@
           <w:sz w:val="28"/>
           <w:szCs w:val="28"/>
         </w:rPr>
-        <w:t>Baseado</w:t>
+        <w:t>muitos tem</w:t>
       </w:r>
       <w:proofErr w:type="gramEnd"/>
       <w:r>
@@ -1791,7 +1976,7 @@
           <w:sz w:val="28"/>
           <w:szCs w:val="28"/>
         </w:rPr>
-        <w:t xml:space="preserve"> nisso, decidimos ajudar criando o </w:t>
+        <w:t xml:space="preserve"> dificuldade em ter uma organização ideal, Baseado nisso, decidimos ajudar criando o </w:t>
       </w:r>
       <w:proofErr w:type="spellStart"/>
       <w:r>
@@ -2069,7 +2254,7 @@
 </file>
 
 <file path=word/endnotes.xml><?xml version="1.0" encoding="utf-8"?>
-<w:endnotes xmlns:wpc="http://schemas.microsoft.com/office/word/2010/wordprocessingCanvas" xmlns:cx="http://schemas.microsoft.com/office/drawing/2014/chartex" xmlns:cx1="http://schemas.microsoft.com/office/drawing/2015/9/8/chartex" xmlns:cx2="http://schemas.microsoft.com/office/drawing/2015/10/21/chartex" xmlns:cx3="http://schemas.microsoft.com/office/drawing/2016/5/9/chartex" xmlns:cx4="http://schemas.microsoft.com/office/drawing/2016/5/10/chartex" xmlns:cx5="http://schemas.microsoft.com/office/drawing/2016/5/11/chartex" xmlns:cx6="http://schemas.microsoft.com/office/drawing/2016/5/12/chartex" xmlns:cx7="http://schemas.microsoft.com/office/drawing/2016/5/13/chartex" xmlns:cx8="http://schemas.microsoft.com/office/drawing/2016/5/14/chartex" xmlns:mc="http://schemas.openxmlformats.org/markup-compatibility/2006" xmlns:aink="http://schemas.microsoft.com/office/drawing/2016/ink" xmlns:am3d="http://schemas.microsoft.com/office/drawing/2017/model3d" xmlns:o="urn:schemas-microsoft-com:office:office" xmlns:oel="http://schemas.microsoft.com/office/2019/extlst" xmlns:r="http://schemas.openxmlformats.org/officeDocument/2006/relationships" xmlns:m="http://schemas.openxmlformats.org/officeDocument/2006/math" xmlns:v="urn:schemas-microsoft-com:vml" xmlns:wp14="http://schemas.microsoft.com/office/word/2010/wordprocessingDrawing" xmlns:wp="http://schemas.openxmlformats.org/drawingml/2006/wordprocessingDrawing" xmlns:w10="urn:schemas-microsoft-com:office:word" xmlns:w="http://schemas.openxmlformats.org/wordprocessingml/2006/main" xmlns:w14="http://schemas.microsoft.com/office/word/2010/wordml" xmlns:w15="http://schemas.microsoft.com/office/word/2012/wordml" xmlns:w16cex="http://schemas.microsoft.com/office/word/2018/wordml/cex" xmlns:w16cid="http://schemas.microsoft.com/office/word/2016/wordml/cid" xmlns:w16="http://schemas.microsoft.com/office/word/2018/wordml" xmlns:w16du="http://schemas.microsoft.com/office/word/2023/wordml/word16du" xmlns:w16sdtdh="http://schemas.microsoft.com/office/word/2020/wordml/sdtdatahash" xmlns:w16sdtfl="http://schemas.microsoft.com/office/word/2024/wordml/sdtformatlock" xmlns:w16se="http://schemas.microsoft.com/office/word/2015/wordml/symex" xmlns:wpg="http://schemas.microsoft.com/office/word/2010/wordprocessingGroup" xmlns:wpi="http://schemas.microsoft.com/office/word/2010/wordprocessingInk" xmlns:wne="http://schemas.microsoft.com/office/word/2006/wordml" xmlns:wps="http://schemas.microsoft.com/office/word/2010/wordprocessingShape" mc:Ignorable="w14 w15 w16se w16cid w16 w16cex w16sdtdh w16sdtfl w16du wp14">
+<w:endnotes xmlns:wpc="http://schemas.microsoft.com/office/word/2010/wordprocessingCanvas" xmlns:cx="http://schemas.microsoft.com/office/drawing/2014/chartex" xmlns:mc="http://schemas.openxmlformats.org/markup-compatibility/2006" xmlns:o="urn:schemas-microsoft-com:office:office" xmlns:r="http://schemas.openxmlformats.org/officeDocument/2006/relationships" xmlns:m="http://schemas.openxmlformats.org/officeDocument/2006/math" xmlns:v="urn:schemas-microsoft-com:vml" xmlns:wp14="http://schemas.microsoft.com/office/word/2010/wordprocessingDrawing" xmlns:wp="http://schemas.openxmlformats.org/drawingml/2006/wordprocessingDrawing" xmlns:w10="urn:schemas-microsoft-com:office:word" xmlns:w="http://schemas.openxmlformats.org/wordprocessingml/2006/main" xmlns:w14="http://schemas.microsoft.com/office/word/2010/wordml" xmlns:w15="http://schemas.microsoft.com/office/word/2012/wordml" xmlns:w16se="http://schemas.microsoft.com/office/word/2015/wordml/symex" xmlns:wpg="http://schemas.microsoft.com/office/word/2010/wordprocessingGroup" xmlns:wpi="http://schemas.microsoft.com/office/word/2010/wordprocessingInk" xmlns:wne="http://schemas.microsoft.com/office/word/2006/wordml" xmlns:wps="http://schemas.microsoft.com/office/word/2010/wordprocessingShape" mc:Ignorable="w14 w15 w16se wp14">
   <w:endnote w:type="separator" w:id="-1">
     <w:p>
       <w:pPr>
@@ -2094,7 +2279,7 @@
 </file>
 
 <file path=word/footnotes.xml><?xml version="1.0" encoding="utf-8"?>
-<w:footnotes xmlns:wpc="http://schemas.microsoft.com/office/word/2010/wordprocessingCanvas" xmlns:cx="http://schemas.microsoft.com/office/drawing/2014/chartex" xmlns:cx1="http://schemas.microsoft.com/office/drawing/2015/9/8/chartex" xmlns:cx2="http://schemas.microsoft.com/office/drawing/2015/10/21/chartex" xmlns:cx3="http://schemas.microsoft.com/office/drawing/2016/5/9/chartex" xmlns:cx4="http://schemas.microsoft.com/office/drawing/2016/5/10/chartex" xmlns:cx5="http://schemas.microsoft.com/office/drawing/2016/5/11/chartex" xmlns:cx6="http://schemas.microsoft.com/office/drawing/2016/5/12/chartex" xmlns:cx7="http://schemas.microsoft.com/office/drawing/2016/5/13/chartex" xmlns:cx8="http://schemas.microsoft.com/office/drawing/2016/5/14/chartex" xmlns:mc="http://schemas.openxmlformats.org/markup-compatibility/2006" xmlns:aink="http://schemas.microsoft.com/office/drawing/2016/ink" xmlns:am3d="http://schemas.microsoft.com/office/drawing/2017/model3d" xmlns:o="urn:schemas-microsoft-com:office:office" xmlns:oel="http://schemas.microsoft.com/office/2019/extlst" xmlns:r="http://schemas.openxmlformats.org/officeDocument/2006/relationships" xmlns:m="http://schemas.openxmlformats.org/officeDocument/2006/math" xmlns:v="urn:schemas-microsoft-com:vml" xmlns:wp14="http://schemas.microsoft.com/office/word/2010/wordprocessingDrawing" xmlns:wp="http://schemas.openxmlformats.org/drawingml/2006/wordprocessingDrawing" xmlns:w10="urn:schemas-microsoft-com:office:word" xmlns:w="http://schemas.openxmlformats.org/wordprocessingml/2006/main" xmlns:w14="http://schemas.microsoft.com/office/word/2010/wordml" xmlns:w15="http://schemas.microsoft.com/office/word/2012/wordml" xmlns:w16cex="http://schemas.microsoft.com/office/word/2018/wordml/cex" xmlns:w16cid="http://schemas.microsoft.com/office/word/2016/wordml/cid" xmlns:w16="http://schemas.microsoft.com/office/word/2018/wordml" xmlns:w16du="http://schemas.microsoft.com/office/word/2023/wordml/word16du" xmlns:w16sdtdh="http://schemas.microsoft.com/office/word/2020/wordml/sdtdatahash" xmlns:w16sdtfl="http://schemas.microsoft.com/office/word/2024/wordml/sdtformatlock" xmlns:w16se="http://schemas.microsoft.com/office/word/2015/wordml/symex" xmlns:wpg="http://schemas.microsoft.com/office/word/2010/wordprocessingGroup" xmlns:wpi="http://schemas.microsoft.com/office/word/2010/wordprocessingInk" xmlns:wne="http://schemas.microsoft.com/office/word/2006/wordml" xmlns:wps="http://schemas.microsoft.com/office/word/2010/wordprocessingShape" mc:Ignorable="w14 w15 w16se w16cid w16 w16cex w16sdtdh w16sdtfl w16du wp14">
+<w:footnotes xmlns:wpc="http://schemas.microsoft.com/office/word/2010/wordprocessingCanvas" xmlns:cx="http://schemas.microsoft.com/office/drawing/2014/chartex" xmlns:mc="http://schemas.openxmlformats.org/markup-compatibility/2006" xmlns:o="urn:schemas-microsoft-com:office:office" xmlns:r="http://schemas.openxmlformats.org/officeDocument/2006/relationships" xmlns:m="http://schemas.openxmlformats.org/officeDocument/2006/math" xmlns:v="urn:schemas-microsoft-com:vml" xmlns:wp14="http://schemas.microsoft.com/office/word/2010/wordprocessingDrawing" xmlns:wp="http://schemas.openxmlformats.org/drawingml/2006/wordprocessingDrawing" xmlns:w10="urn:schemas-microsoft-com:office:word" xmlns:w="http://schemas.openxmlformats.org/wordprocessingml/2006/main" xmlns:w14="http://schemas.microsoft.com/office/word/2010/wordml" xmlns:w15="http://schemas.microsoft.com/office/word/2012/wordml" xmlns:w16se="http://schemas.microsoft.com/office/word/2015/wordml/symex" xmlns:wpg="http://schemas.microsoft.com/office/word/2010/wordprocessingGroup" xmlns:wpi="http://schemas.microsoft.com/office/word/2010/wordprocessingInk" xmlns:wne="http://schemas.microsoft.com/office/word/2006/wordml" xmlns:wps="http://schemas.microsoft.com/office/word/2010/wordprocessingShape" mc:Ignorable="w14 w15 w16se wp14">
   <w:footnote w:type="separator" w:id="-1">
     <w:p>
       <w:pPr>
@@ -2119,7 +2304,7 @@
 </file>
 
 <file path=word/header1.xml><?xml version="1.0" encoding="utf-8"?>
-<w:hdr xmlns:wpc="http://schemas.microsoft.com/office/word/2010/wordprocessingCanvas" xmlns:cx="http://schemas.microsoft.com/office/drawing/2014/chartex" xmlns:cx1="http://schemas.microsoft.com/office/drawing/2015/9/8/chartex" xmlns:cx2="http://schemas.microsoft.com/office/drawing/2015/10/21/chartex" xmlns:cx3="http://schemas.microsoft.com/office/drawing/2016/5/9/chartex" xmlns:cx4="http://schemas.microsoft.com/office/drawing/2016/5/10/chartex" xmlns:cx5="http://schemas.microsoft.com/office/drawing/2016/5/11/chartex" xmlns:cx6="http://schemas.microsoft.com/office/drawing/2016/5/12/chartex" xmlns:cx7="http://schemas.microsoft.com/office/drawing/2016/5/13/chartex" xmlns:cx8="http://schemas.microsoft.com/office/drawing/2016/5/14/chartex" xmlns:mc="http://schemas.openxmlformats.org/markup-compatibility/2006" xmlns:aink="http://schemas.microsoft.com/office/drawing/2016/ink" xmlns:am3d="http://schemas.microsoft.com/office/drawing/2017/model3d" xmlns:o="urn:schemas-microsoft-com:office:office" xmlns:oel="http://schemas.microsoft.com/office/2019/extlst" xmlns:r="http://schemas.openxmlformats.org/officeDocument/2006/relationships" xmlns:m="http://schemas.openxmlformats.org/officeDocument/2006/math" xmlns:v="urn:schemas-microsoft-com:vml" xmlns:wp14="http://schemas.microsoft.com/office/word/2010/wordprocessingDrawing" xmlns:wp="http://schemas.openxmlformats.org/drawingml/2006/wordprocessingDrawing" xmlns:w10="urn:schemas-microsoft-com:office:word" xmlns:w="http://schemas.openxmlformats.org/wordprocessingml/2006/main" xmlns:w14="http://schemas.microsoft.com/office/word/2010/wordml" xmlns:w15="http://schemas.microsoft.com/office/word/2012/wordml" xmlns:w16cex="http://schemas.microsoft.com/office/word/2018/wordml/cex" xmlns:w16cid="http://schemas.microsoft.com/office/word/2016/wordml/cid" xmlns:w16="http://schemas.microsoft.com/office/word/2018/wordml" xmlns:w16du="http://schemas.microsoft.com/office/word/2023/wordml/word16du" xmlns:w16sdtdh="http://schemas.microsoft.com/office/word/2020/wordml/sdtdatahash" xmlns:w16sdtfl="http://schemas.microsoft.com/office/word/2024/wordml/sdtformatlock" xmlns:w16se="http://schemas.microsoft.com/office/word/2015/wordml/symex" xmlns:wpg="http://schemas.microsoft.com/office/word/2010/wordprocessingGroup" xmlns:wpi="http://schemas.microsoft.com/office/word/2010/wordprocessingInk" xmlns:wne="http://schemas.microsoft.com/office/word/2006/wordml" xmlns:wps="http://schemas.microsoft.com/office/word/2010/wordprocessingShape" mc:Ignorable="w14 w15 w16se w16cid w16 w16cex w16sdtdh w16sdtfl w16du wp14">
+<w:hdr xmlns:wpc="http://schemas.microsoft.com/office/word/2010/wordprocessingCanvas" xmlns:cx="http://schemas.microsoft.com/office/drawing/2014/chartex" xmlns:mc="http://schemas.openxmlformats.org/markup-compatibility/2006" xmlns:o="urn:schemas-microsoft-com:office:office" xmlns:r="http://schemas.openxmlformats.org/officeDocument/2006/relationships" xmlns:m="http://schemas.openxmlformats.org/officeDocument/2006/math" xmlns:v="urn:schemas-microsoft-com:vml" xmlns:wp14="http://schemas.microsoft.com/office/word/2010/wordprocessingDrawing" xmlns:wp="http://schemas.openxmlformats.org/drawingml/2006/wordprocessingDrawing" xmlns:w10="urn:schemas-microsoft-com:office:word" xmlns:w="http://schemas.openxmlformats.org/wordprocessingml/2006/main" xmlns:w14="http://schemas.microsoft.com/office/word/2010/wordml" xmlns:w15="http://schemas.microsoft.com/office/word/2012/wordml" xmlns:w16se="http://schemas.microsoft.com/office/word/2015/wordml/symex" xmlns:wpg="http://schemas.microsoft.com/office/word/2010/wordprocessingGroup" xmlns:wpi="http://schemas.microsoft.com/office/word/2010/wordprocessingInk" xmlns:wne="http://schemas.microsoft.com/office/word/2006/wordml" xmlns:wps="http://schemas.microsoft.com/office/word/2010/wordprocessingShape" mc:Ignorable="w14 w15 w16se wp14">
   <w:p>
     <w:pPr>
       <w:pStyle w:val="Cabealho"/>
@@ -2135,7 +2320,7 @@
 </file>
 
 <file path=word/header2.xml><?xml version="1.0" encoding="utf-8"?>
-<w:hdr xmlns:wpc="http://schemas.microsoft.com/office/word/2010/wordprocessingCanvas" xmlns:cx="http://schemas.microsoft.com/office/drawing/2014/chartex" xmlns:cx1="http://schemas.microsoft.com/office/drawing/2015/9/8/chartex" xmlns:cx2="http://schemas.microsoft.com/office/drawing/2015/10/21/chartex" xmlns:cx3="http://schemas.microsoft.com/office/drawing/2016/5/9/chartex" xmlns:cx4="http://schemas.microsoft.com/office/drawing/2016/5/10/chartex" xmlns:cx5="http://schemas.microsoft.com/office/drawing/2016/5/11/chartex" xmlns:cx6="http://schemas.microsoft.com/office/drawing/2016/5/12/chartex" xmlns:cx7="http://schemas.microsoft.com/office/drawing/2016/5/13/chartex" xmlns:cx8="http://schemas.microsoft.com/office/drawing/2016/5/14/chartex" xmlns:mc="http://schemas.openxmlformats.org/markup-compatibility/2006" xmlns:aink="http://schemas.microsoft.com/office/drawing/2016/ink" xmlns:am3d="http://schemas.microsoft.com/office/drawing/2017/model3d" xmlns:o="urn:schemas-microsoft-com:office:office" xmlns:oel="http://schemas.microsoft.com/office/2019/extlst" xmlns:r="http://schemas.openxmlformats.org/officeDocument/2006/relationships" xmlns:m="http://schemas.openxmlformats.org/officeDocument/2006/math" xmlns:v="urn:schemas-microsoft-com:vml" xmlns:wp14="http://schemas.microsoft.com/office/word/2010/wordprocessingDrawing" xmlns:wp="http://schemas.openxmlformats.org/drawingml/2006/wordprocessingDrawing" xmlns:w10="urn:schemas-microsoft-com:office:word" xmlns:w="http://schemas.openxmlformats.org/wordprocessingml/2006/main" xmlns:w14="http://schemas.microsoft.com/office/word/2010/wordml" xmlns:w15="http://schemas.microsoft.com/office/word/2012/wordml" xmlns:w16cex="http://schemas.microsoft.com/office/word/2018/wordml/cex" xmlns:w16cid="http://schemas.microsoft.com/office/word/2016/wordml/cid" xmlns:w16="http://schemas.microsoft.com/office/word/2018/wordml" xmlns:w16du="http://schemas.microsoft.com/office/word/2023/wordml/word16du" xmlns:w16sdtdh="http://schemas.microsoft.com/office/word/2020/wordml/sdtdatahash" xmlns:w16sdtfl="http://schemas.microsoft.com/office/word/2024/wordml/sdtformatlock" xmlns:w16se="http://schemas.microsoft.com/office/word/2015/wordml/symex" xmlns:wpg="http://schemas.microsoft.com/office/word/2010/wordprocessingGroup" xmlns:wpi="http://schemas.microsoft.com/office/word/2010/wordprocessingInk" xmlns:wne="http://schemas.microsoft.com/office/word/2006/wordml" xmlns:wps="http://schemas.microsoft.com/office/word/2010/wordprocessingShape" mc:Ignorable="w14 w15 w16se w16cid w16 w16cex w16sdtdh w16sdtfl w16du wp14">
+<w:hdr xmlns:wpc="http://schemas.microsoft.com/office/word/2010/wordprocessingCanvas" xmlns:cx="http://schemas.microsoft.com/office/drawing/2014/chartex" xmlns:mc="http://schemas.openxmlformats.org/markup-compatibility/2006" xmlns:o="urn:schemas-microsoft-com:office:office" xmlns:r="http://schemas.openxmlformats.org/officeDocument/2006/relationships" xmlns:m="http://schemas.openxmlformats.org/officeDocument/2006/math" xmlns:v="urn:schemas-microsoft-com:vml" xmlns:wp14="http://schemas.microsoft.com/office/word/2010/wordprocessingDrawing" xmlns:wp="http://schemas.openxmlformats.org/drawingml/2006/wordprocessingDrawing" xmlns:w10="urn:schemas-microsoft-com:office:word" xmlns:w="http://schemas.openxmlformats.org/wordprocessingml/2006/main" xmlns:w14="http://schemas.microsoft.com/office/word/2010/wordml" xmlns:w15="http://schemas.microsoft.com/office/word/2012/wordml" xmlns:w16se="http://schemas.microsoft.com/office/word/2015/wordml/symex" xmlns:wpg="http://schemas.microsoft.com/office/word/2010/wordprocessingGroup" xmlns:wpi="http://schemas.microsoft.com/office/word/2010/wordprocessingInk" xmlns:wne="http://schemas.microsoft.com/office/word/2006/wordml" xmlns:wps="http://schemas.microsoft.com/office/word/2010/wordprocessingShape" mc:Ignorable="w14 w15 w16se wp14">
   <w:sdt>
     <w:sdtPr>
       <w:id w:val="-915942934"/>
@@ -2144,6 +2329,7 @@
         <w:docPartUnique/>
       </w:docPartObj>
     </w:sdtPr>
+    <w:sdtEndPr/>
     <w:sdtContent>
       <w:p>
         <w:pPr>
@@ -2177,7 +2363,7 @@
 </file>
 
 <file path=word/header3.xml><?xml version="1.0" encoding="utf-8"?>
-<w:hdr xmlns:wpc="http://schemas.microsoft.com/office/word/2010/wordprocessingCanvas" xmlns:cx="http://schemas.microsoft.com/office/drawing/2014/chartex" xmlns:cx1="http://schemas.microsoft.com/office/drawing/2015/9/8/chartex" xmlns:cx2="http://schemas.microsoft.com/office/drawing/2015/10/21/chartex" xmlns:cx3="http://schemas.microsoft.com/office/drawing/2016/5/9/chartex" xmlns:cx4="http://schemas.microsoft.com/office/drawing/2016/5/10/chartex" xmlns:cx5="http://schemas.microsoft.com/office/drawing/2016/5/11/chartex" xmlns:cx6="http://schemas.microsoft.com/office/drawing/2016/5/12/chartex" xmlns:cx7="http://schemas.microsoft.com/office/drawing/2016/5/13/chartex" xmlns:cx8="http://schemas.microsoft.com/office/drawing/2016/5/14/chartex" xmlns:mc="http://schemas.openxmlformats.org/markup-compatibility/2006" xmlns:aink="http://schemas.microsoft.com/office/drawing/2016/ink" xmlns:am3d="http://schemas.microsoft.com/office/drawing/2017/model3d" xmlns:o="urn:schemas-microsoft-com:office:office" xmlns:oel="http://schemas.microsoft.com/office/2019/extlst" xmlns:r="http://schemas.openxmlformats.org/officeDocument/2006/relationships" xmlns:m="http://schemas.openxmlformats.org/officeDocument/2006/math" xmlns:v="urn:schemas-microsoft-com:vml" xmlns:wp14="http://schemas.microsoft.com/office/word/2010/wordprocessingDrawing" xmlns:wp="http://schemas.openxmlformats.org/drawingml/2006/wordprocessingDrawing" xmlns:w10="urn:schemas-microsoft-com:office:word" xmlns:w="http://schemas.openxmlformats.org/wordprocessingml/2006/main" xmlns:w14="http://schemas.microsoft.com/office/word/2010/wordml" xmlns:w15="http://schemas.microsoft.com/office/word/2012/wordml" xmlns:w16cex="http://schemas.microsoft.com/office/word/2018/wordml/cex" xmlns:w16cid="http://schemas.microsoft.com/office/word/2016/wordml/cid" xmlns:w16="http://schemas.microsoft.com/office/word/2018/wordml" xmlns:w16du="http://schemas.microsoft.com/office/word/2023/wordml/word16du" xmlns:w16sdtdh="http://schemas.microsoft.com/office/word/2020/wordml/sdtdatahash" xmlns:w16sdtfl="http://schemas.microsoft.com/office/word/2024/wordml/sdtformatlock" xmlns:w16se="http://schemas.microsoft.com/office/word/2015/wordml/symex" xmlns:wpg="http://schemas.microsoft.com/office/word/2010/wordprocessingGroup" xmlns:wpi="http://schemas.microsoft.com/office/word/2010/wordprocessingInk" xmlns:wne="http://schemas.microsoft.com/office/word/2006/wordml" xmlns:wps="http://schemas.microsoft.com/office/word/2010/wordprocessingShape" mc:Ignorable="w14 w15 w16se w16cid w16 w16cex w16sdtdh w16sdtfl w16du wp14">
+<w:hdr xmlns:wpc="http://schemas.microsoft.com/office/word/2010/wordprocessingCanvas" xmlns:cx="http://schemas.microsoft.com/office/drawing/2014/chartex" xmlns:mc="http://schemas.openxmlformats.org/markup-compatibility/2006" xmlns:o="urn:schemas-microsoft-com:office:office" xmlns:r="http://schemas.openxmlformats.org/officeDocument/2006/relationships" xmlns:m="http://schemas.openxmlformats.org/officeDocument/2006/math" xmlns:v="urn:schemas-microsoft-com:vml" xmlns:wp14="http://schemas.microsoft.com/office/word/2010/wordprocessingDrawing" xmlns:wp="http://schemas.openxmlformats.org/drawingml/2006/wordprocessingDrawing" xmlns:w10="urn:schemas-microsoft-com:office:word" xmlns:w="http://schemas.openxmlformats.org/wordprocessingml/2006/main" xmlns:w14="http://schemas.microsoft.com/office/word/2010/wordml" xmlns:w15="http://schemas.microsoft.com/office/word/2012/wordml" xmlns:w16se="http://schemas.microsoft.com/office/word/2015/wordml/symex" xmlns:wpg="http://schemas.microsoft.com/office/word/2010/wordprocessingGroup" xmlns:wpi="http://schemas.microsoft.com/office/word/2010/wordprocessingInk" xmlns:wne="http://schemas.microsoft.com/office/word/2006/wordml" xmlns:wps="http://schemas.microsoft.com/office/word/2010/wordprocessingShape" mc:Ignorable="w14 w15 w16se wp14">
   <w:sdt>
     <w:sdtPr>
       <w:id w:val="-1350567595"/>
@@ -2186,6 +2372,7 @@
         <w:docPartUnique/>
       </w:docPartObj>
     </w:sdtPr>
+    <w:sdtEndPr/>
     <w:sdtContent>
       <w:p>
         <w:pPr>
@@ -2202,6 +2389,9 @@
           <w:fldChar w:fldCharType="separate"/>
         </w:r>
         <w:r>
+          <w:rPr>
+            <w:noProof/>
+          </w:rPr>
           <w:t>2</w:t>
         </w:r>
         <w:r>
@@ -2219,7 +2409,7 @@
 </file>
 
 <file path=word/numbering.xml><?xml version="1.0" encoding="utf-8"?>
-<w:numbering xmlns:wpc="http://schemas.microsoft.com/office/word/2010/wordprocessingCanvas" xmlns:cx="http://schemas.microsoft.com/office/drawing/2014/chartex" xmlns:cx1="http://schemas.microsoft.com/office/drawing/2015/9/8/chartex" xmlns:cx2="http://schemas.microsoft.com/office/drawing/2015/10/21/chartex" xmlns:cx3="http://schemas.microsoft.com/office/drawing/2016/5/9/chartex" xmlns:cx4="http://schemas.microsoft.com/office/drawing/2016/5/10/chartex" xmlns:cx5="http://schemas.microsoft.com/office/drawing/2016/5/11/chartex" xmlns:cx6="http://schemas.microsoft.com/office/drawing/2016/5/12/chartex" xmlns:cx7="http://schemas.microsoft.com/office/drawing/2016/5/13/chartex" xmlns:cx8="http://schemas.microsoft.com/office/drawing/2016/5/14/chartex" xmlns:mc="http://schemas.openxmlformats.org/markup-compatibility/2006" xmlns:aink="http://schemas.microsoft.com/office/drawing/2016/ink" xmlns:am3d="http://schemas.microsoft.com/office/drawing/2017/model3d" xmlns:o="urn:schemas-microsoft-com:office:office" xmlns:oel="http://schemas.microsoft.com/office/2019/extlst" xmlns:r="http://schemas.openxmlformats.org/officeDocument/2006/relationships" xmlns:m="http://schemas.openxmlformats.org/officeDocument/2006/math" xmlns:v="urn:schemas-microsoft-com:vml" xmlns:wp14="http://schemas.microsoft.com/office/word/2010/wordprocessingDrawing" xmlns:wp="http://schemas.openxmlformats.org/drawingml/2006/wordprocessingDrawing" xmlns:w10="urn:schemas-microsoft-com:office:word" xmlns:w="http://schemas.openxmlformats.org/wordprocessingml/2006/main" xmlns:w14="http://schemas.microsoft.com/office/word/2010/wordml" xmlns:w15="http://schemas.microsoft.com/office/word/2012/wordml" xmlns:w16cex="http://schemas.microsoft.com/office/word/2018/wordml/cex" xmlns:w16cid="http://schemas.microsoft.com/office/word/2016/wordml/cid" xmlns:w16="http://schemas.microsoft.com/office/word/2018/wordml" xmlns:w16du="http://schemas.microsoft.com/office/word/2023/wordml/word16du" xmlns:w16sdtdh="http://schemas.microsoft.com/office/word/2020/wordml/sdtdatahash" xmlns:w16sdtfl="http://schemas.microsoft.com/office/word/2024/wordml/sdtformatlock" xmlns:w16se="http://schemas.microsoft.com/office/word/2015/wordml/symex" xmlns:wpg="http://schemas.microsoft.com/office/word/2010/wordprocessingGroup" xmlns:wpi="http://schemas.microsoft.com/office/word/2010/wordprocessingInk" xmlns:wne="http://schemas.microsoft.com/office/word/2006/wordml" xmlns:wps="http://schemas.microsoft.com/office/word/2010/wordprocessingShape" mc:Ignorable="w14 w15 w16se w16cid w16 w16cex w16sdtdh w16sdtfl w16du wp14">
+<w:numbering xmlns:wpc="http://schemas.microsoft.com/office/word/2010/wordprocessingCanvas" xmlns:cx="http://schemas.microsoft.com/office/drawing/2014/chartex" xmlns:mc="http://schemas.openxmlformats.org/markup-compatibility/2006" xmlns:o="urn:schemas-microsoft-com:office:office" xmlns:r="http://schemas.openxmlformats.org/officeDocument/2006/relationships" xmlns:m="http://schemas.openxmlformats.org/officeDocument/2006/math" xmlns:v="urn:schemas-microsoft-com:vml" xmlns:wp14="http://schemas.microsoft.com/office/word/2010/wordprocessingDrawing" xmlns:wp="http://schemas.openxmlformats.org/drawingml/2006/wordprocessingDrawing" xmlns:w10="urn:schemas-microsoft-com:office:word" xmlns:w="http://schemas.openxmlformats.org/wordprocessingml/2006/main" xmlns:w14="http://schemas.microsoft.com/office/word/2010/wordml" xmlns:w15="http://schemas.microsoft.com/office/word/2012/wordml" xmlns:w16se="http://schemas.microsoft.com/office/word/2015/wordml/symex" xmlns:wpg="http://schemas.microsoft.com/office/word/2010/wordprocessingGroup" xmlns:wpi="http://schemas.microsoft.com/office/word/2010/wordprocessingInk" xmlns:wne="http://schemas.microsoft.com/office/word/2006/wordml" xmlns:wps="http://schemas.microsoft.com/office/word/2010/wordprocessingShape" mc:Ignorable="w14 w15 w16se wp14">
   <w:abstractNum w:abstractNumId="0" w15:restartNumberingAfterBreak="0">
     <w:nsid w:val="4F286AE2"/>
     <w:multiLevelType w:val="hybridMultilevel"/>
@@ -2309,14 +2499,14 @@
       </w:pPr>
     </w:lvl>
   </w:abstractNum>
-  <w:num w:numId="1" w16cid:durableId="1891726059">
+  <w:num w:numId="1">
     <w:abstractNumId w:val="0"/>
   </w:num>
 </w:numbering>
 </file>
 
 <file path=word/styles.xml><?xml version="1.0" encoding="utf-8"?>
-<w:styles xmlns:mc="http://schemas.openxmlformats.org/markup-compatibility/2006" xmlns:r="http://schemas.openxmlformats.org/officeDocument/2006/relationships" xmlns:w="http://schemas.openxmlformats.org/wordprocessingml/2006/main" xmlns:w14="http://schemas.microsoft.com/office/word/2010/wordml" xmlns:w15="http://schemas.microsoft.com/office/word/2012/wordml" xmlns:w16cex="http://schemas.microsoft.com/office/word/2018/wordml/cex" xmlns:w16cid="http://schemas.microsoft.com/office/word/2016/wordml/cid" xmlns:w16="http://schemas.microsoft.com/office/word/2018/wordml" xmlns:w16du="http://schemas.microsoft.com/office/word/2023/wordml/word16du" xmlns:w16sdtdh="http://schemas.microsoft.com/office/word/2020/wordml/sdtdatahash" xmlns:w16sdtfl="http://schemas.microsoft.com/office/word/2024/wordml/sdtformatlock" xmlns:w16se="http://schemas.microsoft.com/office/word/2015/wordml/symex" mc:Ignorable="w14 w15 w16se w16cid w16 w16cex w16sdtdh w16sdtfl w16du">
+<w:styles xmlns:mc="http://schemas.openxmlformats.org/markup-compatibility/2006" xmlns:r="http://schemas.openxmlformats.org/officeDocument/2006/relationships" xmlns:w="http://schemas.openxmlformats.org/wordprocessingml/2006/main" xmlns:w14="http://schemas.microsoft.com/office/word/2010/wordml" xmlns:w15="http://schemas.microsoft.com/office/word/2012/wordml" xmlns:w16se="http://schemas.microsoft.com/office/word/2015/wordml/symex" mc:Ignorable="w14 w15 w16se">
   <w:docDefaults>
     <w:rPrDefault>
       <w:rPr>
@@ -2332,7 +2522,7 @@
       </w:pPr>
     </w:pPrDefault>
   </w:docDefaults>
-  <w:latentStyles w:defLockedState="0" w:defUIPriority="99" w:defSemiHidden="0" w:defUnhideWhenUsed="0" w:defQFormat="0" w:count="376">
+  <w:latentStyles w:defLockedState="0" w:defUIPriority="99" w:defSemiHidden="0" w:defUnhideWhenUsed="0" w:defQFormat="0" w:count="371">
     <w:lsdException w:name="Normal" w:uiPriority="0" w:qFormat="1"/>
     <w:lsdException w:name="heading 1" w:uiPriority="9" w:qFormat="1"/>
     <w:lsdException w:name="heading 2" w:semiHidden="1" w:uiPriority="9" w:unhideWhenUsed="1" w:qFormat="1"/>
@@ -2704,11 +2894,6 @@
     <w:lsdException w:name="List Table 5 Dark Accent 6" w:uiPriority="50"/>
     <w:lsdException w:name="List Table 6 Colorful Accent 6" w:uiPriority="51"/>
     <w:lsdException w:name="List Table 7 Colorful Accent 6" w:uiPriority="52"/>
-    <w:lsdException w:name="Mention" w:semiHidden="1" w:unhideWhenUsed="1"/>
-    <w:lsdException w:name="Smart Hyperlink" w:semiHidden="1" w:unhideWhenUsed="1"/>
-    <w:lsdException w:name="Hashtag" w:semiHidden="1" w:unhideWhenUsed="1"/>
-    <w:lsdException w:name="Unresolved Mention" w:semiHidden="1" w:unhideWhenUsed="1"/>
-    <w:lsdException w:name="Smart Link" w:semiHidden="1" w:unhideWhenUsed="1"/>
   </w:latentStyles>
   <w:style w:type="paragraph" w:default="1" w:styleId="Normal">
     <w:name w:val="Normal"/>
@@ -2948,6 +3133,17 @@
     <w:semiHidden/>
     <w:unhideWhenUsed/>
     <w:rsid w:val="00C0046D"/>
+  </w:style>
+  <w:style w:type="character" w:styleId="nfase">
+    <w:name w:val="Emphasis"/>
+    <w:basedOn w:val="Fontepargpadro"/>
+    <w:uiPriority w:val="20"/>
+    <w:qFormat/>
+    <w:rsid w:val="00B22F03"/>
+    <w:rPr>
+      <w:i/>
+      <w:iCs/>
+    </w:rPr>
   </w:style>
 </w:styles>
 </file>
@@ -3218,7 +3414,7 @@
 </file>
 
 <file path=customXml/itemProps1.xml><?xml version="1.0" encoding="utf-8"?>
-<ds:datastoreItem xmlns:ds="http://schemas.openxmlformats.org/officeDocument/2006/customXml" ds:itemID="{3AEED4B4-13F7-4D48-8CBA-FE4EA8C91CA3}">
+<ds:datastoreItem xmlns:ds="http://schemas.openxmlformats.org/officeDocument/2006/customXml" ds:itemID="{0B789A79-3E17-4B05-B09C-5457AB72F940}">
   <ds:schemaRefs>
     <ds:schemaRef ds:uri="http://schemas.openxmlformats.org/officeDocument/2006/bibliography"/>
   </ds:schemaRefs>

</xml_diff>